<commit_message>
siglip2: 보고서 9.1·README 설치 명령 — 한국어 Windows pip 24.0 한글 주석 오류 대책, 9.4 MiB↔MB
- 9.1·README: venv 켠 뒤 `python -m pip install --upgrade pip`, `export PYTHONUTF8=1`,
  Git Bash activate 경로(`source .venv/Scripts/activate`), PowerShell 안내(`$env:PYTHONUTF8`, Activate.ps1)
  · Python 3.11.9 기본 pip 24.0이 requirements의 한글 주석을 cp949로 읽다 실패(10/14 G3_repro와 같음).
    새 venv에서 재현: 그대로 실패, PYTHONUTF8=1 또는 pip 26.2.2로 통과
- 9.4: 스크립트 출력 MiB(453.95 → 166.35)와 보고서 MB(476.0 → 174.4)의 관계
- report_prelim_final.docx 다시 만듦(21쪽, 빈 쪽 없음), PROGRESS 11/1 기록

Co-Authored-By: Claude Opus 5.5 <noreply@anthropic.com>
</commit_message>
<xml_diff>
--- a/siglip2/docs/report_prelim_final.docx
+++ b/siglip2/docs/report_prelim_final.docx
@@ -13311,7 +13311,7 @@
                 <w:sz w:val="15"/>
                 <w:szCs w:val="15"/>
               </w:rPr>
-              <w:t xml:space="preserve"># Windows: .venv\Scripts\activate</w:t>
+              <w:t xml:space="preserve">source .venv/bin/activate          # Windows(Git Bash): source .venv/Scripts/activate</w:t>
             </w:r>
           </w:p>
           <w:p>
@@ -13326,7 +13326,22 @@
                 <w:sz w:val="15"/>
                 <w:szCs w:val="15"/>
               </w:rPr>
-              <w:t xml:space="preserve"># Linux/macOS: source .venv/bin/activate</w:t>
+              <w:t xml:space="preserve">python -m pip install --upgrade pip  # Python 3.11 기본 pip 24.0은 한국어 Windows에서 한글 주석을 못 읽음</w:t>
+            </w:r>
+          </w:p>
+          <w:p>
+            <w:pPr>
+              <w:shd w:val="clear" w:color="auto" w:fill="F3F3F3"/>
+              <w:spacing w:after="0" w:line="240" w:lineRule="auto"/>
+              <w:ind w:left="60"/>
+            </w:pPr>
+            <w:r>
+              <w:rPr>
+                <w:rFonts w:ascii="Consolas" w:hAnsi="Consolas" w:eastAsia="맑은 고딕"/>
+                <w:sz w:val="15"/>
+                <w:szCs w:val="15"/>
+              </w:rPr>
+              <w:t xml:space="preserve">export PYTHONUTF8=1</w:t>
             </w:r>
           </w:p>
           <w:p>
@@ -13573,7 +13588,27 @@
             </w:r>
             <w:r>
               <w:rPr/>
-              <w:t xml:space="preserve">처럼 쓴다.</w:t>
+              <w:t xml:space="preserve">처럼 쓴다(</w:t>
+            </w:r>
+            <w:r>
+              <w:rPr>
+                <w:rFonts w:ascii="Consolas" w:hAnsi="Consolas"/>
+              </w:rPr>
+              <w:t xml:space="preserve">$env:PYTHONUTF8="1"</w:t>
+            </w:r>
+            <w:r>
+              <w:rPr/>
+              <w:t xml:space="preserve"> 포함). 가상환경은 </w:t>
+            </w:r>
+            <w:r>
+              <w:rPr>
+                <w:rFonts w:ascii="Consolas" w:hAnsi="Consolas"/>
+              </w:rPr>
+              <w:t xml:space="preserve">.venv\Scripts\Activate.ps1</w:t>
+            </w:r>
+            <w:r>
+              <w:rPr/>
+              <w:t xml:space="preserve">로 켠다.</w:t>
             </w:r>
           </w:p>
           <w:p>
@@ -15043,6 +15078,19 @@
             <w:r>
               <w:rPr/>
               <w:t xml:space="preserve">dev 캐시 생성에 1~2시간, test 7종에 약 3시간, 디스크 약 20 GB가 필요하다(처음 한 번 Hugging Face 가중치를 받음). GPU는 필요 없고, 빠른 확인은 9.2 (가)로 충분하다.</w:t>
+            </w:r>
+          </w:p>
+          <w:p>
+            <w:pPr>
+              <w:numPr>
+                <w:ilvl w:val="0"/>
+                <w:numId w:val="108"/>
+              </w:numPr>
+              <w:spacing w:after="40" w:line="288" w:lineRule="auto"/>
+            </w:pPr>
+            <w:r>
+              <w:rPr/>
+              <w:t xml:space="preserve">메모리는 스크립트가 MiB로 출력하고(FP32 453.95 → 제출 모델 166.35 MiB) 보고서에는 MB(= MiB × 1.048576, 476.0 → 174.4)로 적었다. 변화율(−63.4%)은 같다.</w:t>
             </w:r>
           </w:p>
           <w:p/>

</xml_diff>